<commit_message>
HFCS poster: add fructose-content and ERS availability figures, public health context tiles, fuller discussion; update AMA reference list
Co-Authored-By: Claude Opus 5.5 <noreply@anthropic.com>
Claude-Session: https://claude.ai/code/session_01GDCp9vaBDB24tAeq3Z16Kb
</commit_message>
<xml_diff>
--- a/HFCS_Poster_References_AMA.docx
+++ b/HFCS_Poster_References_AMA.docx
@@ -239,7 +239,7 @@
       <w:r>
         <w:t>10.</w:t>
         <w:tab/>
-        <w:t>US Department of Agriculture, Economic Research Service. High fructose corn syrup availability peaked in 1999. Published May 1, 2013. Accessed December 21, 2025. https://www.ers.usda.gov/data-products/chart-gallery/chart-detail?chartId=57655</w:t>
+        <w:t>US Department of Agriculture, Economic Research Service. Caloric sweetener availability dropped nearly 20 percent since 1999. Published December 2, 2024. Accessed December 21, 2025. https://www.ers.usda.gov/data-products/charts-of-note/chart-detail?chartId=110515</w:t>
       </w:r>
     </w:p>
     <w:p>
@@ -485,7 +485,7 @@
         <w:spacing w:after="160"/>
       </w:pPr>
       <w:r>
-        <w:t>US Department of Agriculture, Economic Research Service. Caloric sweetener availability dropped nearly 20 percent since 1999. Published December 2, 2024. Accessed December 21, 2025. https://www.ers.usda.gov/data-products/charts-of-note/chart-detail?chartId=110515</w:t>
+        <w:t>US Department of Agriculture, Economic Research Service. High fructose corn syrup availability peaked in 1999. Published May 1, 2013. Accessed December 21, 2025. https://www.ers.usda.gov/data-products/chart-gallery/chart-detail?chartId=57655</w:t>
       </w:r>
     </w:p>
     <w:sectPr>

</xml_diff>

<commit_message>
HFCS poster: cite all 24 sources in reading order; full 24-item AMA reference list for QR code
Co-Authored-By: Claude Opus 5.5 <noreply@anthropic.com>
Claude-Session: https://claude.ai/code/session_01GDCp9vaBDB24tAeq3Z16Kb
</commit_message>
<xml_diff>
--- a/HFCS_Poster_References_AMA.docx
+++ b/HFCS_Poster_References_AMA.docx
@@ -34,7 +34,7 @@
         <w:pStyle w:val="Heading1"/>
       </w:pPr>
       <w:r>
-        <w:t>References cited on the poster (1–14)</w:t>
+        <w:t>References cited on the poster (1–24)</w:t>
       </w:r>
     </w:p>
     <w:p>
@@ -150,6 +150,26 @@
       <w:r>
         <w:t>6.</w:t>
         <w:tab/>
+        <w:t xml:space="preserve">Rizkalla SW. Health implications of fructose consumption: a review of recent data. </w:t>
+      </w:r>
+      <w:r>
+        <w:rPr>
+          <w:i/>
+        </w:rPr>
+        <w:t>Nutr Metab (Lond)</w:t>
+      </w:r>
+      <w:r>
+        <w:t>. 2010;7:82. doi:10.1186/1743-7075-7-82</w:t>
+      </w:r>
+    </w:p>
+    <w:p>
+      <w:pPr>
+        <w:spacing w:after="160"/>
+        <w:ind w:left="576" w:hanging="576"/>
+      </w:pPr>
+      <w:r>
+        <w:t>7.</w:t>
+        <w:tab/>
         <w:t xml:space="preserve">DeChristopher LR. 40 years of adding more fructose to high fructose corn syrup than is safe, through the lens of malabsorption and altered gut health—gateways to chronic disease. </w:t>
       </w:r>
       <w:r>
@@ -168,7 +188,47 @@
         <w:ind w:left="576" w:hanging="576"/>
       </w:pPr>
       <w:r>
-        <w:t>7.</w:t>
+        <w:t>8.</w:t>
+        <w:tab/>
+        <w:t xml:space="preserve">Aoyagi T, Ohira G, Hayano K, Martin O, Takabe K. High-fructose corn syrup on inflammation and cancer. </w:t>
+      </w:r>
+      <w:r>
+        <w:rPr>
+          <w:i/>
+        </w:rPr>
+        <w:t>World J Oncol</w:t>
+      </w:r>
+      <w:r>
+        <w:t>. 2025;16(6):531-537. doi:10.14740/wjon2652</w:t>
+      </w:r>
+    </w:p>
+    <w:p>
+      <w:pPr>
+        <w:spacing w:after="160"/>
+        <w:ind w:left="576" w:hanging="576"/>
+      </w:pPr>
+      <w:r>
+        <w:t>9.</w:t>
+        <w:tab/>
+        <w:t xml:space="preserve">US Department of Agriculture; US Department of Health and Human Services. </w:t>
+      </w:r>
+      <w:r>
+        <w:rPr>
+          <w:i/>
+        </w:rPr>
+        <w:t>Dietary Guidelines for Americans, 2020–2025</w:t>
+      </w:r>
+      <w:r>
+        <w:t>. 9th ed. Published December 2020. Accessed December 21, 2025. https://www.dietaryguidelines.gov/sites/default/files/2020-12/Dietary_Guidelines_for_Americans_2020-2025.pdf</w:t>
+      </w:r>
+    </w:p>
+    <w:p>
+      <w:pPr>
+        <w:spacing w:after="160"/>
+        <w:ind w:left="576" w:hanging="576"/>
+      </w:pPr>
+      <w:r>
+        <w:t>10.</w:t>
         <w:tab/>
         <w:t xml:space="preserve">US Department of Agriculture; US Department of Health and Human Services. </w:t>
       </w:r>
@@ -197,7 +257,7 @@
         <w:ind w:left="576" w:hanging="576"/>
       </w:pPr>
       <w:r>
-        <w:t>8.</w:t>
+        <w:t>11.</w:t>
         <w:tab/>
         <w:t xml:space="preserve">Fukagawa NK, McKillop K, Pehrsson PR, Moshfegh A, Harnly J, Finley J. USDA’s FoodData Central: what is it and why is it needed today? </w:t>
       </w:r>
@@ -217,7 +277,7 @@
         <w:ind w:left="576" w:hanging="576"/>
       </w:pPr>
       <w:r>
-        <w:t>9.</w:t>
+        <w:t>12.</w:t>
         <w:tab/>
         <w:t xml:space="preserve">Larrick B, Kretser A, McKillop K, et al. Update on “A Partnership for Public Health: USDA Global Branded Food Products Database.” </w:t>
       </w:r>
@@ -237,7 +297,38 @@
         <w:ind w:left="576" w:hanging="576"/>
       </w:pPr>
       <w:r>
-        <w:t>10.</w:t>
+        <w:t>13.</w:t>
+        <w:tab/>
+        <w:t xml:space="preserve">US Department of Agriculture, Agricultural Research Service. </w:t>
+      </w:r>
+      <w:r>
+        <w:rPr>
+          <w:i/>
+        </w:rPr>
+        <w:t>FoodData Central: USDA Global Branded Food Products Database (GBFPD) Documentation and Download User Guide</w:t>
+      </w:r>
+      <w:r>
+        <w:t>. Published April 2023. Accessed December 21, 2025. https://fdc.nal.usda.gov/docs/GBFPD_Documentation_and_Download_User_Guide_Apr2023.pdf</w:t>
+      </w:r>
+    </w:p>
+    <w:p>
+      <w:pPr>
+        <w:spacing w:after="160"/>
+        <w:ind w:left="576" w:hanging="576"/>
+      </w:pPr>
+      <w:r>
+        <w:t>14.</w:t>
+        <w:tab/>
+        <w:t>US Department of Agriculture, Agricultural Research Service. FoodData Central: branded foods search. Accessed December 13, 2025. https://fdc.nal.usda.gov/food-search?type=Branded</w:t>
+      </w:r>
+    </w:p>
+    <w:p>
+      <w:pPr>
+        <w:spacing w:after="160"/>
+        <w:ind w:left="576" w:hanging="576"/>
+      </w:pPr>
+      <w:r>
+        <w:t>15.</w:t>
         <w:tab/>
         <w:t>US Department of Agriculture, Economic Research Service. Caloric sweetener availability dropped nearly 20 percent since 1999. Published December 2, 2024. Accessed December 21, 2025. https://www.ers.usda.gov/data-products/charts-of-note/chart-detail?chartId=110515</w:t>
       </w:r>
@@ -248,7 +339,7 @@
         <w:ind w:left="576" w:hanging="576"/>
       </w:pPr>
       <w:r>
-        <w:t>11.</w:t>
+        <w:t>16.</w:t>
         <w:tab/>
         <w:t xml:space="preserve">Martínez Steele E, Baraldi LG, Louzada ML, Moubarac JC, Mozaffarian D, Monteiro CA. Ultra-processed foods and added sugars in the US diet: evidence from a nationally representative cross-sectional study. </w:t>
       </w:r>
@@ -268,7 +359,18 @@
         <w:ind w:left="576" w:hanging="576"/>
       </w:pPr>
       <w:r>
-        <w:t>12.</w:t>
+        <w:t>17.</w:t>
+        <w:tab/>
+        <w:t>US Department of Agriculture, Economic Research Service. High fructose corn syrup availability peaked in 1999. Published May 1, 2013. Accessed December 21, 2025. https://www.ers.usda.gov/data-products/chart-gallery/chart-detail?chartId=57655</w:t>
+      </w:r>
+    </w:p>
+    <w:p>
+      <w:pPr>
+        <w:spacing w:after="160"/>
+        <w:ind w:left="576" w:hanging="576"/>
+      </w:pPr>
+      <w:r>
+        <w:t>18.</w:t>
         <w:tab/>
         <w:t xml:space="preserve">Nguyen M, Jarvis SE, Tinajero MG, et al. Sugar-sweetened beverage consumption and weight gain in children and adults: a systematic review and meta-analysis of prospective cohort studies and randomized controlled trials. </w:t>
       </w:r>
@@ -288,7 +390,7 @@
         <w:ind w:left="576" w:hanging="576"/>
       </w:pPr>
       <w:r>
-        <w:t>13.</w:t>
+        <w:t>19.</w:t>
         <w:tab/>
         <w:t xml:space="preserve">Li X, Luan Y, Li Y, et al. The effect of high-fructose corn syrup vs. sucrose on anthropometric and metabolic parameters: a systematic review and meta-analysis. </w:t>
       </w:r>
@@ -308,48 +410,48 @@
         <w:ind w:left="576" w:hanging="576"/>
       </w:pPr>
       <w:r>
-        <w:t>14.</w:t>
+        <w:t>20.</w:t>
         <w:tab/>
-        <w:t>US Food and Drug Administration. Added sugars on the Nutrition Facts label. Updated March 5, 2024. Accessed December 21, 2025. https://www.fda.gov/food/nutrition-facts-label/added-sugars-nutrition-facts-label</w:t>
-      </w:r>
-    </w:p>
-    <w:p>
-      <w:pPr>
-        <w:pStyle w:val="Heading1"/>
-      </w:pPr>
-      <w:r>
-        <w:t>Additional references cited in the full paper</w:t>
-      </w:r>
-    </w:p>
-    <w:p>
-      <w:r>
-        <w:t>Listed alphabetically; numbered separately in the full paper.</w:t>
-      </w:r>
-    </w:p>
-    <w:p>
-      <w:pPr>
-        <w:pStyle w:val="ListBullet"/>
-        <w:spacing w:after="160"/>
-      </w:pPr>
-      <w:r>
-        <w:t xml:space="preserve">Aoyagi T, Ohira G, Hayano K, Martin O, Takabe K. High-fructose corn syrup on inflammation and cancer. </w:t>
+        <w:t xml:space="preserve">Rippe JM. The health implications of sucrose, high-fructose corn syrup, and fructose: what do we really know? </w:t>
       </w:r>
       <w:r>
         <w:rPr>
           <w:i/>
         </w:rPr>
-        <w:t>World J Oncol</w:t>
+        <w:t>J Diabetes Sci Technol</w:t>
       </w:r>
       <w:r>
-        <w:t>. 2025;16(6):531-537. doi:10.14740/wjon2652</w:t>
+        <w:t>. 2010;4(4):1008-1011. doi:10.1177/193229681000400433</w:t>
       </w:r>
     </w:p>
     <w:p>
       <w:pPr>
-        <w:pStyle w:val="ListBullet"/>
         <w:spacing w:after="160"/>
+        <w:ind w:left="576" w:hanging="576"/>
       </w:pPr>
       <w:r>
+        <w:t>21.</w:t>
+        <w:tab/>
+        <w:t xml:space="preserve">Li Z, Forester S, Jennings-Dobbs E, Heber D. Perspective: a comprehensive evaluation of data quality in nutrient databases. </w:t>
+      </w:r>
+      <w:r>
+        <w:rPr>
+          <w:i/>
+        </w:rPr>
+        <w:t>Adv Nutr</w:t>
+      </w:r>
+      <w:r>
+        <w:t>. 2023;14(3):379-391. doi:10.1016/j.advnut.2023.02.005</w:t>
+      </w:r>
+    </w:p>
+    <w:p>
+      <w:pPr>
+        <w:spacing w:after="160"/>
+        <w:ind w:left="576" w:hanging="576"/>
+      </w:pPr>
+      <w:r>
+        <w:t>22.</w:t>
+        <w:tab/>
         <w:t xml:space="preserve">Food and Drug Administration, HHS. Food labeling: revision of the Nutrition and Supplement Facts labels. </w:t>
       </w:r>
       <w:r>
@@ -364,10 +466,23 @@
     </w:p>
     <w:p>
       <w:pPr>
-        <w:pStyle w:val="ListBullet"/>
         <w:spacing w:after="160"/>
+        <w:ind w:left="576" w:hanging="576"/>
       </w:pPr>
       <w:r>
+        <w:t>23.</w:t>
+        <w:tab/>
+        <w:t>US Food and Drug Administration. Added sugars on the Nutrition Facts label. Updated March 5, 2024. Accessed December 21, 2025. https://www.fda.gov/food/nutrition-facts-label/added-sugars-nutrition-facts-label</w:t>
+      </w:r>
+    </w:p>
+    <w:p>
+      <w:pPr>
+        <w:spacing w:after="160"/>
+        <w:ind w:left="576" w:hanging="576"/>
+      </w:pPr>
+      <w:r>
+        <w:t>24.</w:t>
+        <w:tab/>
         <w:t xml:space="preserve">Lancaster KJ. Current intake and demographic disparities in the association of fructose-rich foods and metabolic syndrome. </w:t>
       </w:r>
       <w:r>
@@ -378,114 +493,6 @@
       </w:r>
       <w:r>
         <w:t>. 2020;3(7):e2010224. doi:10.1001/jamanetworkopen.2020.10224</w:t>
-      </w:r>
-    </w:p>
-    <w:p>
-      <w:pPr>
-        <w:pStyle w:val="ListBullet"/>
-        <w:spacing w:after="160"/>
-      </w:pPr>
-      <w:r>
-        <w:t xml:space="preserve">Li Z, Forester S, Jennings-Dobbs E, Heber D. Perspective: a comprehensive evaluation of data quality in nutrient databases. </w:t>
-      </w:r>
-      <w:r>
-        <w:rPr>
-          <w:i/>
-        </w:rPr>
-        <w:t>Adv Nutr</w:t>
-      </w:r>
-      <w:r>
-        <w:t>. 2023;14(3):379-391. doi:10.1016/j.advnut.2023.02.005</w:t>
-      </w:r>
-    </w:p>
-    <w:p>
-      <w:pPr>
-        <w:pStyle w:val="ListBullet"/>
-        <w:spacing w:after="160"/>
-      </w:pPr>
-      <w:r>
-        <w:t xml:space="preserve">Rippe JM. The health implications of sucrose, high-fructose corn syrup, and fructose: what do we really know? </w:t>
-      </w:r>
-      <w:r>
-        <w:rPr>
-          <w:i/>
-        </w:rPr>
-        <w:t>J Diabetes Sci Technol</w:t>
-      </w:r>
-      <w:r>
-        <w:t>. 2010;4(4):1008-1011. doi:10.1177/193229681000400433</w:t>
-      </w:r>
-    </w:p>
-    <w:p>
-      <w:pPr>
-        <w:pStyle w:val="ListBullet"/>
-        <w:spacing w:after="160"/>
-      </w:pPr>
-      <w:r>
-        <w:t xml:space="preserve">Rizkalla SW. Health implications of fructose consumption: a review of recent data. </w:t>
-      </w:r>
-      <w:r>
-        <w:rPr>
-          <w:i/>
-        </w:rPr>
-        <w:t>Nutr Metab (Lond)</w:t>
-      </w:r>
-      <w:r>
-        <w:t>. 2010;7:82. doi:10.1186/1743-7075-7-82</w:t>
-      </w:r>
-    </w:p>
-    <w:p>
-      <w:pPr>
-        <w:pStyle w:val="ListBullet"/>
-        <w:spacing w:after="160"/>
-      </w:pPr>
-      <w:r>
-        <w:t xml:space="preserve">US Department of Agriculture; US Department of Health and Human Services. </w:t>
-      </w:r>
-      <w:r>
-        <w:rPr>
-          <w:i/>
-        </w:rPr>
-        <w:t>Dietary Guidelines for Americans, 2020–2025</w:t>
-      </w:r>
-      <w:r>
-        <w:t>. 9th ed. Published December 2020. Accessed December 21, 2025. https://www.dietaryguidelines.gov/sites/default/files/2020-12/Dietary_Guidelines_for_Americans_2020-2025.pdf</w:t>
-      </w:r>
-    </w:p>
-    <w:p>
-      <w:pPr>
-        <w:pStyle w:val="ListBullet"/>
-        <w:spacing w:after="160"/>
-      </w:pPr>
-      <w:r>
-        <w:t>US Department of Agriculture, Agricultural Research Service. FoodData Central: branded foods search. Accessed December 13, 2025. https://fdc.nal.usda.gov/food-search?type=Branded</w:t>
-      </w:r>
-    </w:p>
-    <w:p>
-      <w:pPr>
-        <w:pStyle w:val="ListBullet"/>
-        <w:spacing w:after="160"/>
-      </w:pPr>
-      <w:r>
-        <w:t xml:space="preserve">US Department of Agriculture, Agricultural Research Service. </w:t>
-      </w:r>
-      <w:r>
-        <w:rPr>
-          <w:i/>
-        </w:rPr>
-        <w:t>FoodData Central: USDA Global Branded Food Products Database (GBFPD) Documentation and Download User Guide</w:t>
-      </w:r>
-      <w:r>
-        <w:t>. Published April 2023. Accessed December 21, 2025. https://fdc.nal.usda.gov/docs/GBFPD_Documentation_and_Download_User_Guide_Apr2023.pdf</w:t>
-      </w:r>
-    </w:p>
-    <w:p>
-      <w:pPr>
-        <w:pStyle w:val="ListBullet"/>
-        <w:spacing w:after="160"/>
-      </w:pPr>
-      <w:r>
-        <w:t>US Department of Agriculture, Economic Research Service. High fructose corn syrup availability peaked in 1999. Published May 1, 2013. Accessed December 21, 2025. https://www.ers.usda.gov/data-products/chart-gallery/chart-detail?chartId=57655</w:t>
       </w:r>
     </w:p>
     <w:sectPr>

</xml_diff>

<commit_message>
HFCS poster back to 14 citations; reference document expanded with paper references and further reading (34 total)
Co-Authored-By: Claude Opus 5.5 <noreply@anthropic.com>
Claude-Session: https://claude.ai/code/session_01GDCp9vaBDB24tAeq3Z16Kb
</commit_message>
<xml_diff>
--- a/HFCS_Poster_References_AMA.docx
+++ b/HFCS_Poster_References_AMA.docx
@@ -34,7 +34,7 @@
         <w:pStyle w:val="Heading1"/>
       </w:pPr>
       <w:r>
-        <w:t>References cited on the poster (1–24)</w:t>
+        <w:t>References cited on the poster (1–14)</w:t>
       </w:r>
     </w:p>
     <w:p>
@@ -150,26 +150,6 @@
       <w:r>
         <w:t>6.</w:t>
         <w:tab/>
-        <w:t xml:space="preserve">Rizkalla SW. Health implications of fructose consumption: a review of recent data. </w:t>
-      </w:r>
-      <w:r>
-        <w:rPr>
-          <w:i/>
-        </w:rPr>
-        <w:t>Nutr Metab (Lond)</w:t>
-      </w:r>
-      <w:r>
-        <w:t>. 2010;7:82. doi:10.1186/1743-7075-7-82</w:t>
-      </w:r>
-    </w:p>
-    <w:p>
-      <w:pPr>
-        <w:spacing w:after="160"/>
-        <w:ind w:left="576" w:hanging="576"/>
-      </w:pPr>
-      <w:r>
-        <w:t>7.</w:t>
-        <w:tab/>
         <w:t xml:space="preserve">DeChristopher LR. 40 years of adding more fructose to high fructose corn syrup than is safe, through the lens of malabsorption and altered gut health—gateways to chronic disease. </w:t>
       </w:r>
       <w:r>
@@ -188,47 +168,7 @@
         <w:ind w:left="576" w:hanging="576"/>
       </w:pPr>
       <w:r>
-        <w:t>8.</w:t>
-        <w:tab/>
-        <w:t xml:space="preserve">Aoyagi T, Ohira G, Hayano K, Martin O, Takabe K. High-fructose corn syrup on inflammation and cancer. </w:t>
-      </w:r>
-      <w:r>
-        <w:rPr>
-          <w:i/>
-        </w:rPr>
-        <w:t>World J Oncol</w:t>
-      </w:r>
-      <w:r>
-        <w:t>. 2025;16(6):531-537. doi:10.14740/wjon2652</w:t>
-      </w:r>
-    </w:p>
-    <w:p>
-      <w:pPr>
-        <w:spacing w:after="160"/>
-        <w:ind w:left="576" w:hanging="576"/>
-      </w:pPr>
-      <w:r>
-        <w:t>9.</w:t>
-        <w:tab/>
-        <w:t xml:space="preserve">US Department of Agriculture; US Department of Health and Human Services. </w:t>
-      </w:r>
-      <w:r>
-        <w:rPr>
-          <w:i/>
-        </w:rPr>
-        <w:t>Dietary Guidelines for Americans, 2020–2025</w:t>
-      </w:r>
-      <w:r>
-        <w:t>. 9th ed. Published December 2020. Accessed December 21, 2025. https://www.dietaryguidelines.gov/sites/default/files/2020-12/Dietary_Guidelines_for_Americans_2020-2025.pdf</w:t>
-      </w:r>
-    </w:p>
-    <w:p>
-      <w:pPr>
-        <w:spacing w:after="160"/>
-        <w:ind w:left="576" w:hanging="576"/>
-      </w:pPr>
-      <w:r>
-        <w:t>10.</w:t>
+        <w:t>7.</w:t>
         <w:tab/>
         <w:t xml:space="preserve">US Department of Agriculture; US Department of Health and Human Services. </w:t>
       </w:r>
@@ -257,7 +197,7 @@
         <w:ind w:left="576" w:hanging="576"/>
       </w:pPr>
       <w:r>
-        <w:t>11.</w:t>
+        <w:t>8.</w:t>
         <w:tab/>
         <w:t xml:space="preserve">Fukagawa NK, McKillop K, Pehrsson PR, Moshfegh A, Harnly J, Finley J. USDA’s FoodData Central: what is it and why is it needed today? </w:t>
       </w:r>
@@ -277,7 +217,7 @@
         <w:ind w:left="576" w:hanging="576"/>
       </w:pPr>
       <w:r>
-        <w:t>12.</w:t>
+        <w:t>9.</w:t>
         <w:tab/>
         <w:t xml:space="preserve">Larrick B, Kretser A, McKillop K, et al. Update on “A Partnership for Public Health: USDA Global Branded Food Products Database.” </w:t>
       </w:r>
@@ -297,38 +237,7 @@
         <w:ind w:left="576" w:hanging="576"/>
       </w:pPr>
       <w:r>
-        <w:t>13.</w:t>
-        <w:tab/>
-        <w:t xml:space="preserve">US Department of Agriculture, Agricultural Research Service. </w:t>
-      </w:r>
-      <w:r>
-        <w:rPr>
-          <w:i/>
-        </w:rPr>
-        <w:t>FoodData Central: USDA Global Branded Food Products Database (GBFPD) Documentation and Download User Guide</w:t>
-      </w:r>
-      <w:r>
-        <w:t>. Published April 2023. Accessed December 21, 2025. https://fdc.nal.usda.gov/docs/GBFPD_Documentation_and_Download_User_Guide_Apr2023.pdf</w:t>
-      </w:r>
-    </w:p>
-    <w:p>
-      <w:pPr>
-        <w:spacing w:after="160"/>
-        <w:ind w:left="576" w:hanging="576"/>
-      </w:pPr>
-      <w:r>
-        <w:t>14.</w:t>
-        <w:tab/>
-        <w:t>US Department of Agriculture, Agricultural Research Service. FoodData Central: branded foods search. Accessed December 13, 2025. https://fdc.nal.usda.gov/food-search?type=Branded</w:t>
-      </w:r>
-    </w:p>
-    <w:p>
-      <w:pPr>
-        <w:spacing w:after="160"/>
-        <w:ind w:left="576" w:hanging="576"/>
-      </w:pPr>
-      <w:r>
-        <w:t>15.</w:t>
+        <w:t>10.</w:t>
         <w:tab/>
         <w:t>US Department of Agriculture, Economic Research Service. Caloric sweetener availability dropped nearly 20 percent since 1999. Published December 2, 2024. Accessed December 21, 2025. https://www.ers.usda.gov/data-products/charts-of-note/chart-detail?chartId=110515</w:t>
       </w:r>
@@ -339,7 +248,7 @@
         <w:ind w:left="576" w:hanging="576"/>
       </w:pPr>
       <w:r>
-        <w:t>16.</w:t>
+        <w:t>11.</w:t>
         <w:tab/>
         <w:t xml:space="preserve">Martínez Steele E, Baraldi LG, Louzada ML, Moubarac JC, Mozaffarian D, Monteiro CA. Ultra-processed foods and added sugars in the US diet: evidence from a nationally representative cross-sectional study. </w:t>
       </w:r>
@@ -359,18 +268,7 @@
         <w:ind w:left="576" w:hanging="576"/>
       </w:pPr>
       <w:r>
-        <w:t>17.</w:t>
-        <w:tab/>
-        <w:t>US Department of Agriculture, Economic Research Service. High fructose corn syrup availability peaked in 1999. Published May 1, 2013. Accessed December 21, 2025. https://www.ers.usda.gov/data-products/chart-gallery/chart-detail?chartId=57655</w:t>
-      </w:r>
-    </w:p>
-    <w:p>
-      <w:pPr>
-        <w:spacing w:after="160"/>
-        <w:ind w:left="576" w:hanging="576"/>
-      </w:pPr>
-      <w:r>
-        <w:t>18.</w:t>
+        <w:t>12.</w:t>
         <w:tab/>
         <w:t xml:space="preserve">Nguyen M, Jarvis SE, Tinajero MG, et al. Sugar-sweetened beverage consumption and weight gain in children and adults: a systematic review and meta-analysis of prospective cohort studies and randomized controlled trials. </w:t>
       </w:r>
@@ -390,7 +288,7 @@
         <w:ind w:left="576" w:hanging="576"/>
       </w:pPr>
       <w:r>
-        <w:t>19.</w:t>
+        <w:t>13.</w:t>
         <w:tab/>
         <w:t xml:space="preserve">Li X, Luan Y, Li Y, et al. The effect of high-fructose corn syrup vs. sucrose on anthropometric and metabolic parameters: a systematic review and meta-analysis. </w:t>
       </w:r>
@@ -410,8 +308,102 @@
         <w:ind w:left="576" w:hanging="576"/>
       </w:pPr>
       <w:r>
-        <w:t>20.</w:t>
+        <w:t>14.</w:t>
         <w:tab/>
+        <w:t>US Food and Drug Administration. Added sugars on the Nutrition Facts label. Updated March 5, 2024. Accessed December 21, 2025. https://www.fda.gov/food/nutrition-facts-label/added-sugars-nutrition-facts-label</w:t>
+      </w:r>
+    </w:p>
+    <w:p>
+      <w:pPr>
+        <w:pStyle w:val="Heading1"/>
+      </w:pPr>
+      <w:r>
+        <w:t>Additional references cited in the full paper</w:t>
+      </w:r>
+    </w:p>
+    <w:p>
+      <w:r>
+        <w:t>Listed alphabetically; numbered separately in the full paper.</w:t>
+      </w:r>
+    </w:p>
+    <w:p>
+      <w:pPr>
+        <w:pStyle w:val="ListBullet"/>
+        <w:spacing w:after="160"/>
+      </w:pPr>
+      <w:r>
+        <w:t xml:space="preserve">Aoyagi T, Ohira G, Hayano K, Martin O, Takabe K. High-fructose corn syrup on inflammation and cancer. </w:t>
+      </w:r>
+      <w:r>
+        <w:rPr>
+          <w:i/>
+        </w:rPr>
+        <w:t>World J Oncol</w:t>
+      </w:r>
+      <w:r>
+        <w:t>. 2025;16(6):531-537. doi:10.14740/wjon2652</w:t>
+      </w:r>
+    </w:p>
+    <w:p>
+      <w:pPr>
+        <w:pStyle w:val="ListBullet"/>
+        <w:spacing w:after="160"/>
+      </w:pPr>
+      <w:r>
+        <w:t xml:space="preserve">Food and Drug Administration, HHS. Food labeling: revision of the Nutrition and Supplement Facts labels. </w:t>
+      </w:r>
+      <w:r>
+        <w:rPr>
+          <w:i/>
+        </w:rPr>
+        <w:t>Fed Regist</w:t>
+      </w:r>
+      <w:r>
+        <w:t>. 2016;81(103):33742-33999. Accessed December 21, 2025. https://www.govinfo.gov/app/details/FR-2016-05-27/2016-11867</w:t>
+      </w:r>
+    </w:p>
+    <w:p>
+      <w:pPr>
+        <w:pStyle w:val="ListBullet"/>
+        <w:spacing w:after="160"/>
+      </w:pPr>
+      <w:r>
+        <w:t xml:space="preserve">Lancaster KJ. Current intake and demographic disparities in the association of fructose-rich foods and metabolic syndrome. </w:t>
+      </w:r>
+      <w:r>
+        <w:rPr>
+          <w:i/>
+        </w:rPr>
+        <w:t>JAMA Netw Open</w:t>
+      </w:r>
+      <w:r>
+        <w:t>. 2020;3(7):e2010224. doi:10.1001/jamanetworkopen.2020.10224</w:t>
+      </w:r>
+    </w:p>
+    <w:p>
+      <w:pPr>
+        <w:pStyle w:val="ListBullet"/>
+        <w:spacing w:after="160"/>
+      </w:pPr>
+      <w:r>
+        <w:t xml:space="preserve">Li Z, Forester S, Jennings-Dobbs E, Heber D. Perspective: a comprehensive evaluation of data quality in nutrient databases. </w:t>
+      </w:r>
+      <w:r>
+        <w:rPr>
+          <w:i/>
+        </w:rPr>
+        <w:t>Adv Nutr</w:t>
+      </w:r>
+      <w:r>
+        <w:t>. 2023;14(3):379-391. doi:10.1016/j.advnut.2023.02.005</w:t>
+      </w:r>
+    </w:p>
+    <w:p>
+      <w:pPr>
+        <w:pStyle w:val="ListBullet"/>
+        <w:spacing w:after="160"/>
+      </w:pPr>
+      <w:r>
         <w:t xml:space="preserve">Rippe JM. The health implications of sucrose, high-fructose corn syrup, and fructose: what do we really know? </w:t>
       </w:r>
       <w:r>
@@ -426,73 +418,267 @@
     </w:p>
     <w:p>
       <w:pPr>
+        <w:pStyle w:val="ListBullet"/>
         <w:spacing w:after="160"/>
-        <w:ind w:left="576" w:hanging="576"/>
       </w:pPr>
       <w:r>
-        <w:t>21.</w:t>
-        <w:tab/>
-        <w:t xml:space="preserve">Li Z, Forester S, Jennings-Dobbs E, Heber D. Perspective: a comprehensive evaluation of data quality in nutrient databases. </w:t>
+        <w:t xml:space="preserve">Rizkalla SW. Health implications of fructose consumption: a review of recent data. </w:t>
       </w:r>
       <w:r>
         <w:rPr>
           <w:i/>
         </w:rPr>
-        <w:t>Adv Nutr</w:t>
+        <w:t>Nutr Metab (Lond)</w:t>
       </w:r>
       <w:r>
-        <w:t>. 2023;14(3):379-391. doi:10.1016/j.advnut.2023.02.005</w:t>
+        <w:t>. 2010;7:82. doi:10.1186/1743-7075-7-82</w:t>
       </w:r>
     </w:p>
     <w:p>
       <w:pPr>
+        <w:pStyle w:val="ListBullet"/>
         <w:spacing w:after="160"/>
-        <w:ind w:left="576" w:hanging="576"/>
       </w:pPr>
       <w:r>
-        <w:t>22.</w:t>
-        <w:tab/>
-        <w:t xml:space="preserve">Food and Drug Administration, HHS. Food labeling: revision of the Nutrition and Supplement Facts labels. </w:t>
+        <w:t xml:space="preserve">US Department of Agriculture, Agricultural Research Service. </w:t>
       </w:r>
       <w:r>
         <w:rPr>
           <w:i/>
         </w:rPr>
-        <w:t>Fed Regist</w:t>
+        <w:t>FoodData Central: USDA Global Branded Food Products Database (GBFPD) Documentation and Download User Guide</w:t>
       </w:r>
       <w:r>
-        <w:t>. 2016;81(103):33742-33999. Accessed December 21, 2025. https://www.govinfo.gov/app/details/FR-2016-05-27/2016-11867</w:t>
+        <w:t>. Published April 2023. Accessed December 21, 2025. https://fdc.nal.usda.gov/docs/GBFPD_Documentation_and_Download_User_Guide_Apr2023.pdf</w:t>
       </w:r>
     </w:p>
     <w:p>
       <w:pPr>
+        <w:pStyle w:val="ListBullet"/>
         <w:spacing w:after="160"/>
-        <w:ind w:left="576" w:hanging="576"/>
       </w:pPr>
       <w:r>
-        <w:t>23.</w:t>
-        <w:tab/>
-        <w:t>US Food and Drug Administration. Added sugars on the Nutrition Facts label. Updated March 5, 2024. Accessed December 21, 2025. https://www.fda.gov/food/nutrition-facts-label/added-sugars-nutrition-facts-label</w:t>
+        <w:t>US Department of Agriculture, Agricultural Research Service. FoodData Central: branded foods search. Accessed December 13, 2025. https://fdc.nal.usda.gov/food-search?type=Branded</w:t>
       </w:r>
     </w:p>
     <w:p>
       <w:pPr>
+        <w:pStyle w:val="ListBullet"/>
         <w:spacing w:after="160"/>
-        <w:ind w:left="576" w:hanging="576"/>
       </w:pPr>
       <w:r>
-        <w:t>24.</w:t>
-        <w:tab/>
-        <w:t xml:space="preserve">Lancaster KJ. Current intake and demographic disparities in the association of fructose-rich foods and metabolic syndrome. </w:t>
+        <w:t>US Department of Agriculture, Economic Research Service. High fructose corn syrup availability peaked in 1999. Published May 1, 2013. Accessed December 21, 2025. https://www.ers.usda.gov/data-products/chart-gallery/chart-detail?chartId=57655</w:t>
+      </w:r>
+    </w:p>
+    <w:p>
+      <w:pPr>
+        <w:pStyle w:val="ListBullet"/>
+        <w:spacing w:after="160"/>
+      </w:pPr>
+      <w:r>
+        <w:t xml:space="preserve">US Department of Agriculture; US Department of Health and Human Services. </w:t>
       </w:r>
       <w:r>
         <w:rPr>
           <w:i/>
         </w:rPr>
-        <w:t>JAMA Netw Open</w:t>
+        <w:t>Dietary Guidelines for Americans, 2020–2025</w:t>
       </w:r>
       <w:r>
-        <w:t>. 2020;3(7):e2010224. doi:10.1001/jamanetworkopen.2020.10224</w:t>
+        <w:t>. 9th ed. Published December 2020. Accessed December 21, 2025. https://www.dietaryguidelines.gov/sites/default/files/2020-12/Dietary_Guidelines_for_Americans_2020-2025.pdf</w:t>
+      </w:r>
+    </w:p>
+    <w:p>
+      <w:pPr>
+        <w:pStyle w:val="Heading1"/>
+      </w:pPr>
+      <w:r>
+        <w:t>Further reading</w:t>
+      </w:r>
+    </w:p>
+    <w:p>
+      <w:r>
+        <w:t>Key studies and guidance on high-fructose corn syrup, added sugars, and health; listed alphabetically.</w:t>
+      </w:r>
+    </w:p>
+    <w:p>
+      <w:pPr>
+        <w:pStyle w:val="ListBullet"/>
+        <w:spacing w:after="160"/>
+      </w:pPr>
+      <w:r>
+        <w:t xml:space="preserve">Bray GA, Nielsen SJ, Popkin BM. Consumption of high-fructose corn syrup in beverages may play a role in the epidemic of obesity. </w:t>
+      </w:r>
+      <w:r>
+        <w:rPr>
+          <w:i/>
+        </w:rPr>
+        <w:t>Am J Clin Nutr</w:t>
+      </w:r>
+      <w:r>
+        <w:t>. 2004;79(4):537-543. doi:10.1093/ajcn/79.4.537</w:t>
+      </w:r>
+    </w:p>
+    <w:p>
+      <w:pPr>
+        <w:pStyle w:val="ListBullet"/>
+        <w:spacing w:after="160"/>
+      </w:pPr>
+      <w:r>
+        <w:t xml:space="preserve">Goncalves MD, Lu C, Tutnauer J, et al. High-fructose corn syrup enhances intestinal tumor growth in mice. </w:t>
+      </w:r>
+      <w:r>
+        <w:rPr>
+          <w:i/>
+        </w:rPr>
+        <w:t>Science</w:t>
+      </w:r>
+      <w:r>
+        <w:t>. 2019;363(6433):1345-1349. doi:10.1126/science.aat8515</w:t>
+      </w:r>
+    </w:p>
+    <w:p>
+      <w:pPr>
+        <w:pStyle w:val="ListBullet"/>
+        <w:spacing w:after="160"/>
+      </w:pPr>
+      <w:r>
+        <w:t xml:space="preserve">Goran MI, Ulijaszek SJ, Ventura EE. High fructose corn syrup and diabetes prevalence: a global perspective. </w:t>
+      </w:r>
+      <w:r>
+        <w:rPr>
+          <w:i/>
+        </w:rPr>
+        <w:t>Glob Public Health</w:t>
+      </w:r>
+      <w:r>
+        <w:t>. 2013;8(1):55-64. doi:10.1080/17441692.2012.736257</w:t>
+      </w:r>
+    </w:p>
+    <w:p>
+      <w:pPr>
+        <w:pStyle w:val="ListBullet"/>
+        <w:spacing w:after="160"/>
+      </w:pPr>
+      <w:r>
+        <w:t xml:space="preserve">Malik VS, Hu FB. The role of sugar-sweetened beverages in the global epidemics of obesity and chronic diseases. </w:t>
+      </w:r>
+      <w:r>
+        <w:rPr>
+          <w:i/>
+        </w:rPr>
+        <w:t>Nat Rev Endocrinol</w:t>
+      </w:r>
+      <w:r>
+        <w:t>. 2022;18(4):205-218. doi:10.1038/s41574-021-00627-6</w:t>
+      </w:r>
+    </w:p>
+    <w:p>
+      <w:pPr>
+        <w:pStyle w:val="ListBullet"/>
+        <w:spacing w:after="160"/>
+      </w:pPr>
+      <w:r>
+        <w:t xml:space="preserve">Ng SW, Slining MM, Popkin BM. Use of caloric and noncaloric sweeteners in US consumer packaged foods, 2005-2009. </w:t>
+      </w:r>
+      <w:r>
+        <w:rPr>
+          <w:i/>
+        </w:rPr>
+        <w:t>J Acad Nutr Diet</w:t>
+      </w:r>
+      <w:r>
+        <w:t>. 2012;112(11):1828-1834. doi:10.1016/j.jand.2012.07.009</w:t>
+      </w:r>
+    </w:p>
+    <w:p>
+      <w:pPr>
+        <w:pStyle w:val="ListBullet"/>
+        <w:spacing w:after="160"/>
+      </w:pPr>
+      <w:r>
+        <w:t xml:space="preserve">Popkin BM, Hawkes C. Sweetening of the global diet, particularly beverages: patterns, trends, and policy responses. </w:t>
+      </w:r>
+      <w:r>
+        <w:rPr>
+          <w:i/>
+        </w:rPr>
+        <w:t>Lancet Diabetes Endocrinol</w:t>
+      </w:r>
+      <w:r>
+        <w:t>. 2016;4(2):174-186. doi:10.1016/S2213-8587(15)00419-2</w:t>
+      </w:r>
+    </w:p>
+    <w:p>
+      <w:pPr>
+        <w:pStyle w:val="ListBullet"/>
+        <w:spacing w:after="160"/>
+      </w:pPr>
+      <w:r>
+        <w:t xml:space="preserve">Ricciuto L, Fulgoni VL III, Gaine PC, Scott MO, DiFrancesco L. Sources of added sugars intake among the U.S. population: analysis by selected sociodemographic factors using the National Health and Nutrition Examination Survey 2011–18. </w:t>
+      </w:r>
+      <w:r>
+        <w:rPr>
+          <w:i/>
+        </w:rPr>
+        <w:t>Front Nutr</w:t>
+      </w:r>
+      <w:r>
+        <w:t>. 2021;8:687643. doi:10.3389/fnut.2021.687643</w:t>
+      </w:r>
+    </w:p>
+    <w:p>
+      <w:pPr>
+        <w:pStyle w:val="ListBullet"/>
+        <w:spacing w:after="160"/>
+      </w:pPr>
+      <w:r>
+        <w:t xml:space="preserve">Stanhope KL, Schwarz JM, Keim NL, et al. Consuming fructose-sweetened, not glucose-sweetened, beverages increases visceral adiposity and lipids and decreases insulin sensitivity in overweight/obese humans. </w:t>
+      </w:r>
+      <w:r>
+        <w:rPr>
+          <w:i/>
+        </w:rPr>
+        <w:t>J Clin Invest</w:t>
+      </w:r>
+      <w:r>
+        <w:t>. 2009;119(5):1322-1334. doi:10.1172/JCI37385</w:t>
+      </w:r>
+    </w:p>
+    <w:p>
+      <w:pPr>
+        <w:pStyle w:val="ListBullet"/>
+        <w:spacing w:after="160"/>
+      </w:pPr>
+      <w:r>
+        <w:t xml:space="preserve">Te Morenga L, Mallard S, Mann J. Dietary sugars and body weight: systematic review and meta-analyses of randomised controlled trials and cohort studies. </w:t>
+      </w:r>
+      <w:r>
+        <w:rPr>
+          <w:i/>
+        </w:rPr>
+        <w:t>BMJ</w:t>
+      </w:r>
+      <w:r>
+        <w:t>. 2013;346:e7492. doi:10.1136/bmj.e7492</w:t>
+      </w:r>
+    </w:p>
+    <w:p>
+      <w:pPr>
+        <w:pStyle w:val="ListBullet"/>
+        <w:spacing w:after="160"/>
+      </w:pPr>
+      <w:r>
+        <w:t xml:space="preserve">World Health Organization. </w:t>
+      </w:r>
+      <w:r>
+        <w:rPr>
+          <w:i/>
+        </w:rPr>
+        <w:t>Guideline: Sugars Intake for Adults and Children</w:t>
+      </w:r>
+      <w:r>
+        <w:t>. World Health Organization; 2015.</w:t>
       </w:r>
     </w:p>
     <w:sectPr>

</xml_diff>